<commit_message>
lets see what semyanov gonna say about that
</commit_message>
<xml_diff>
--- a/optbench/report/Fedorov_optbench_report.docx
+++ b/optbench/report/Fedorov_optbench_report.docx
@@ -10848,13 +10848,7 @@
                 <w:lang w:val="ru-RU"/>
               </w:rPr>
               <w:lastRenderedPageBreak/>
-              <w:t>Функция</w:t>
-            </w:r>
-            <w:r>
-              <w:rPr>
-                <w:lang w:val="ru-RU"/>
-              </w:rPr>
-              <w:t xml:space="preserve"> </w:t>
+              <w:t xml:space="preserve">Функция </w:t>
             </w:r>
             <w:r>
               <w:t>“</w:t>
@@ -17256,9 +17250,6 @@
             <w:pPr>
               <w:ind w:firstLine="0"/>
               <w:jc w:val="left"/>
-              <w:rPr>
-                <w:lang w:val="ru-RU"/>
-              </w:rPr>
             </w:pPr>
             <w:proofErr w:type="spellStart"/>
             <w:r>
@@ -18593,10 +18584,48 @@
               <w:jc w:val="left"/>
             </w:pPr>
             <w:r>
+              <w:t>sub</w:t>
+            </w:r>
+            <w:r>
+              <w:tab/>
+            </w:r>
+            <w:proofErr w:type="spellStart"/>
+            <w:r>
+              <w:t>rsp</w:t>
+            </w:r>
+            <w:proofErr w:type="spellEnd"/>
+            <w:r>
+              <w:t>, 48</w:t>
+            </w:r>
+          </w:p>
+          <w:p>
+            <w:pPr>
+              <w:ind w:firstLine="0"/>
+              <w:jc w:val="left"/>
+            </w:pPr>
+            <w:r>
               <w:t>.</w:t>
             </w:r>
             <w:proofErr w:type="spellStart"/>
             <w:r>
+              <w:t>seh_stackalloc</w:t>
+            </w:r>
+            <w:proofErr w:type="spellEnd"/>
+            <w:r>
+              <w:tab/>
+              <w:t>48</w:t>
+            </w:r>
+          </w:p>
+          <w:p>
+            <w:pPr>
+              <w:ind w:firstLine="0"/>
+              <w:jc w:val="left"/>
+            </w:pPr>
+            <w:r>
+              <w:t>.</w:t>
+            </w:r>
+            <w:proofErr w:type="spellStart"/>
+            <w:r>
               <w:t>seh_endprologue</w:t>
             </w:r>
             <w:proofErr w:type="spellEnd"/>
@@ -18611,33 +18640,15 @@
             </w:r>
             <w:r>
               <w:tab/>
-              <w:t>DWORD PTR "k"[rip], 100</w:t>
-            </w:r>
-          </w:p>
-          <w:p>
-            <w:pPr>
-              <w:ind w:firstLine="0"/>
-              <w:jc w:val="left"/>
-            </w:pPr>
-            <w:r>
-              <w:t>mov</w:t>
-            </w:r>
-            <w:r>
-              <w:tab/>
-              <w:t>DWORD PTR "x"[rip], 10</w:t>
-            </w:r>
-          </w:p>
-          <w:p>
-            <w:pPr>
-              <w:ind w:firstLine="0"/>
-              <w:jc w:val="left"/>
-            </w:pPr>
-            <w:r>
-              <w:t>mov</w:t>
-            </w:r>
-            <w:r>
-              <w:tab/>
-              <w:t>DWORD PTR "y"[rip], 15</w:t>
+              <w:t>DWORD PTR -4[</w:t>
+            </w:r>
+            <w:proofErr w:type="spellStart"/>
+            <w:r>
+              <w:t>rbp</w:t>
+            </w:r>
+            <w:proofErr w:type="spellEnd"/>
+            <w:r>
+              <w:t>], 100</w:t>
             </w:r>
           </w:p>
           <w:p>
@@ -18753,57 +18764,78 @@
               <w:jc w:val="left"/>
             </w:pPr>
             <w:r>
-              <w:t>mov</w:t>
-            </w:r>
-            <w:r>
-              <w:tab/>
-            </w:r>
-            <w:proofErr w:type="spellStart"/>
-            <w:r>
-              <w:t>eax</w:t>
-            </w:r>
-            <w:proofErr w:type="spellEnd"/>
-            <w:r>
-              <w:t>, DWORD PTR "k"[rip]</w:t>
-            </w:r>
-          </w:p>
-          <w:p>
-            <w:pPr>
-              <w:ind w:firstLine="0"/>
-              <w:jc w:val="left"/>
-            </w:pPr>
-            <w:r>
               <w:t>sub</w:t>
             </w:r>
             <w:r>
               <w:tab/>
-            </w:r>
-            <w:proofErr w:type="spellStart"/>
-            <w:r>
-              <w:t>eax</w:t>
-            </w:r>
-            <w:proofErr w:type="spellEnd"/>
-            <w:r>
-              <w:t>, 1</w:t>
-            </w:r>
-          </w:p>
-          <w:p>
-            <w:pPr>
-              <w:ind w:firstLine="0"/>
-              <w:jc w:val="left"/>
-            </w:pPr>
-            <w:r>
-              <w:t>mov</w:t>
-            </w:r>
-            <w:r>
-              <w:tab/>
-              <w:t xml:space="preserve">DWORD PTR "k"[rip], </w:t>
-            </w:r>
-            <w:proofErr w:type="spellStart"/>
-            <w:r>
-              <w:t>eax</w:t>
-            </w:r>
-            <w:proofErr w:type="spellEnd"/>
+              <w:t>DWORD PTR -4[</w:t>
+            </w:r>
+            <w:proofErr w:type="spellStart"/>
+            <w:r>
+              <w:t>rbp</w:t>
+            </w:r>
+            <w:proofErr w:type="spellEnd"/>
+            <w:r>
+              <w:t>], 1</w:t>
+            </w:r>
+          </w:p>
+          <w:p>
+            <w:pPr>
+              <w:ind w:firstLine="0"/>
+              <w:jc w:val="left"/>
+            </w:pPr>
+            <w:r>
+              <w:t>lea</w:t>
+            </w:r>
+            <w:r>
+              <w:tab/>
+            </w:r>
+            <w:proofErr w:type="spellStart"/>
+            <w:r>
+              <w:t>rax</w:t>
+            </w:r>
+            <w:proofErr w:type="spellEnd"/>
+            <w:r>
+              <w:t>, .LC0[rip]</w:t>
+            </w:r>
+          </w:p>
+          <w:p>
+            <w:pPr>
+              <w:ind w:firstLine="0"/>
+              <w:jc w:val="left"/>
+            </w:pPr>
+            <w:r>
+              <w:t>mov</w:t>
+            </w:r>
+            <w:r>
+              <w:tab/>
+            </w:r>
+            <w:proofErr w:type="spellStart"/>
+            <w:r>
+              <w:t>rcx</w:t>
+            </w:r>
+            <w:proofErr w:type="spellEnd"/>
+            <w:r>
+              <w:t xml:space="preserve">, </w:t>
+            </w:r>
+            <w:proofErr w:type="spellStart"/>
+            <w:r>
+              <w:t>rax</w:t>
+            </w:r>
+            <w:proofErr w:type="spellEnd"/>
+          </w:p>
+          <w:p>
+            <w:pPr>
+              <w:ind w:firstLine="0"/>
+              <w:jc w:val="left"/>
+            </w:pPr>
+            <w:r>
+              <w:t>call</w:t>
+            </w:r>
+            <w:r>
+              <w:tab/>
+              <w:t>"puts"</w:t>
+            </w:r>
           </w:p>
           <w:p>
             <w:pPr>
@@ -18842,30 +18874,103 @@
             </w:r>
             <w:proofErr w:type="spellStart"/>
             <w:r>
+              <w:t>eax</w:t>
+            </w:r>
+            <w:proofErr w:type="spellEnd"/>
+            <w:r>
+              <w:t>, DWORD PTR "x"[rip]</w:t>
+            </w:r>
+          </w:p>
+          <w:p>
+            <w:pPr>
+              <w:ind w:firstLine="0"/>
+              <w:jc w:val="left"/>
+            </w:pPr>
+            <w:r>
+              <w:t>sub</w:t>
+            </w:r>
+            <w:r>
+              <w:tab/>
+              <w:t>DWORD PTR -4[</w:t>
+            </w:r>
+            <w:proofErr w:type="spellStart"/>
+            <w:r>
+              <w:t>rbp</w:t>
+            </w:r>
+            <w:proofErr w:type="spellEnd"/>
+            <w:r>
+              <w:t xml:space="preserve">], </w:t>
+            </w:r>
+            <w:proofErr w:type="spellStart"/>
+            <w:r>
+              <w:t>eax</w:t>
+            </w:r>
+            <w:proofErr w:type="spellEnd"/>
+          </w:p>
+          <w:p>
+            <w:pPr>
+              <w:ind w:firstLine="0"/>
+              <w:jc w:val="left"/>
+            </w:pPr>
+            <w:r>
+              <w:t>.L2:</w:t>
+            </w:r>
+          </w:p>
+          <w:p>
+            <w:pPr>
+              <w:ind w:firstLine="0"/>
+              <w:jc w:val="left"/>
+            </w:pPr>
+            <w:proofErr w:type="spellStart"/>
+            <w:r>
+              <w:t>cmp</w:t>
+            </w:r>
+            <w:proofErr w:type="spellEnd"/>
+            <w:r>
+              <w:tab/>
+              <w:t>DWORD PTR -4[</w:t>
+            </w:r>
+            <w:proofErr w:type="spellStart"/>
+            <w:r>
+              <w:t>rbp</w:t>
+            </w:r>
+            <w:proofErr w:type="spellEnd"/>
+            <w:r>
+              <w:t>], 0</w:t>
+            </w:r>
+          </w:p>
+          <w:p>
+            <w:pPr>
+              <w:ind w:firstLine="0"/>
+              <w:jc w:val="left"/>
+            </w:pPr>
+            <w:proofErr w:type="spellStart"/>
+            <w:r>
+              <w:t>jg</w:t>
+            </w:r>
+            <w:proofErr w:type="spellEnd"/>
+            <w:r>
+              <w:tab/>
+              <w:t>.L4</w:t>
+            </w:r>
+          </w:p>
+          <w:p>
+            <w:pPr>
+              <w:ind w:firstLine="0"/>
+              <w:jc w:val="left"/>
+            </w:pPr>
+            <w:r>
+              <w:t>mov</w:t>
+            </w:r>
+            <w:r>
+              <w:tab/>
+            </w:r>
+            <w:proofErr w:type="spellStart"/>
+            <w:r>
               <w:t>edx</w:t>
             </w:r>
             <w:proofErr w:type="spellEnd"/>
             <w:r>
-              <w:t>, DWORD PTR "k"[rip]</w:t>
-            </w:r>
-          </w:p>
-          <w:p>
-            <w:pPr>
-              <w:ind w:firstLine="0"/>
-              <w:jc w:val="left"/>
-            </w:pPr>
-            <w:r>
-              <w:t>mov</w:t>
-            </w:r>
-            <w:r>
-              <w:tab/>
-            </w:r>
-            <w:proofErr w:type="spellStart"/>
-            <w:r>
-              <w:t>eax</w:t>
-            </w:r>
-            <w:proofErr w:type="spellEnd"/>
-            <w:r>
               <w:t>, DWORD PTR "x"[rip]</w:t>
             </w:r>
           </w:p>
@@ -18875,7 +18980,27 @@
               <w:jc w:val="left"/>
             </w:pPr>
             <w:r>
-              <w:t>sub</w:t>
+              <w:t>mov</w:t>
+            </w:r>
+            <w:r>
+              <w:tab/>
+            </w:r>
+            <w:proofErr w:type="spellStart"/>
+            <w:r>
+              <w:t>eax</w:t>
+            </w:r>
+            <w:proofErr w:type="spellEnd"/>
+            <w:r>
+              <w:t>, DWORD PTR "y"[rip]</w:t>
+            </w:r>
+          </w:p>
+          <w:p>
+            <w:pPr>
+              <w:ind w:firstLine="0"/>
+              <w:jc w:val="left"/>
+            </w:pPr>
+            <w:r>
+              <w:t>add</w:t>
             </w:r>
             <w:r>
               <w:tab/>
@@ -18900,11 +19025,47 @@
               <w:jc w:val="left"/>
             </w:pPr>
             <w:r>
-              <w:t>mov</w:t>
-            </w:r>
-            <w:r>
-              <w:tab/>
-              <w:t xml:space="preserve">DWORD PTR "k"[rip], </w:t>
+              <w:lastRenderedPageBreak/>
+              <w:t>mov</w:t>
+            </w:r>
+            <w:r>
+              <w:tab/>
+            </w:r>
+            <w:proofErr w:type="spellStart"/>
+            <w:r>
+              <w:t>eax</w:t>
+            </w:r>
+            <w:proofErr w:type="spellEnd"/>
+            <w:r>
+              <w:t>, DWORD PTR -4[</w:t>
+            </w:r>
+            <w:proofErr w:type="spellStart"/>
+            <w:r>
+              <w:t>rbp</w:t>
+            </w:r>
+            <w:proofErr w:type="spellEnd"/>
+            <w:r>
+              <w:t>]</w:t>
+            </w:r>
+          </w:p>
+          <w:p>
+            <w:pPr>
+              <w:ind w:firstLine="0"/>
+              <w:jc w:val="left"/>
+            </w:pPr>
+            <w:r>
+              <w:t>add</w:t>
+            </w:r>
+            <w:r>
+              <w:tab/>
+            </w:r>
+            <w:proofErr w:type="spellStart"/>
+            <w:r>
+              <w:t>eax</w:t>
+            </w:r>
+            <w:proofErr w:type="spellEnd"/>
+            <w:r>
+              <w:t xml:space="preserve">, </w:t>
             </w:r>
             <w:proofErr w:type="spellStart"/>
             <w:r>
@@ -18918,91 +19079,19 @@
               <w:jc w:val="left"/>
             </w:pPr>
             <w:r>
-              <w:t>.L2:</w:t>
-            </w:r>
-          </w:p>
-          <w:p>
-            <w:pPr>
-              <w:ind w:firstLine="0"/>
-              <w:jc w:val="left"/>
-            </w:pPr>
-            <w:r>
-              <w:t>mov</w:t>
-            </w:r>
-            <w:r>
-              <w:tab/>
-            </w:r>
-            <w:proofErr w:type="spellStart"/>
-            <w:r>
-              <w:t>eax</w:t>
-            </w:r>
-            <w:proofErr w:type="spellEnd"/>
-            <w:r>
-              <w:t>, DWORD PTR "k"[rip]</w:t>
-            </w:r>
-          </w:p>
-          <w:p>
-            <w:pPr>
-              <w:ind w:firstLine="0"/>
-              <w:jc w:val="left"/>
-            </w:pPr>
-            <w:r>
-              <w:t>test</w:t>
-            </w:r>
-            <w:r>
-              <w:tab/>
-            </w:r>
-            <w:proofErr w:type="spellStart"/>
-            <w:r>
-              <w:t>eax</w:t>
-            </w:r>
-            <w:proofErr w:type="spellEnd"/>
-            <w:r>
-              <w:t xml:space="preserve">, </w:t>
-            </w:r>
-            <w:proofErr w:type="spellStart"/>
-            <w:r>
-              <w:t>eax</w:t>
-            </w:r>
-            <w:proofErr w:type="spellEnd"/>
-          </w:p>
-          <w:p>
-            <w:pPr>
-              <w:ind w:firstLine="0"/>
-              <w:jc w:val="left"/>
-            </w:pPr>
-            <w:proofErr w:type="spellStart"/>
-            <w:r>
-              <w:t>jg</w:t>
-            </w:r>
-            <w:proofErr w:type="spellEnd"/>
-            <w:r>
-              <w:tab/>
-              <w:t>.L4</w:t>
-            </w:r>
-          </w:p>
-          <w:p>
-            <w:pPr>
-              <w:ind w:firstLine="0"/>
-              <w:jc w:val="left"/>
-            </w:pPr>
-            <w:proofErr w:type="spellStart"/>
-            <w:r>
-              <w:t>nop</w:t>
-            </w:r>
-            <w:proofErr w:type="spellEnd"/>
-          </w:p>
-          <w:p>
-            <w:pPr>
-              <w:ind w:firstLine="0"/>
-              <w:jc w:val="left"/>
-            </w:pPr>
-            <w:proofErr w:type="spellStart"/>
-            <w:r>
-              <w:lastRenderedPageBreak/>
-              <w:t>nop</w:t>
-            </w:r>
-            <w:proofErr w:type="spellEnd"/>
+              <w:t>add</w:t>
+            </w:r>
+            <w:r>
+              <w:tab/>
+            </w:r>
+            <w:proofErr w:type="spellStart"/>
+            <w:r>
+              <w:t>rsp</w:t>
+            </w:r>
+            <w:proofErr w:type="spellEnd"/>
+            <w:r>
+              <w:t>, 48</w:t>
+            </w:r>
           </w:p>
           <w:p>
             <w:pPr>
@@ -19059,10 +19148,87 @@
               <w:jc w:val="left"/>
             </w:pPr>
             <w:r>
+              <w:t>push</w:t>
+            </w:r>
+            <w:r>
+              <w:tab/>
+            </w:r>
+            <w:proofErr w:type="spellStart"/>
+            <w:r>
+              <w:t>rbx</w:t>
+            </w:r>
+            <w:proofErr w:type="spellEnd"/>
+          </w:p>
+          <w:p>
+            <w:pPr>
+              <w:ind w:firstLine="0"/>
+              <w:jc w:val="left"/>
+            </w:pPr>
+            <w:r>
               <w:t>.</w:t>
             </w:r>
             <w:proofErr w:type="spellStart"/>
             <w:r>
+              <w:t>seh_pushreg</w:t>
+            </w:r>
+            <w:proofErr w:type="spellEnd"/>
+            <w:r>
+              <w:tab/>
+            </w:r>
+            <w:proofErr w:type="spellStart"/>
+            <w:r>
+              <w:t>rbx</w:t>
+            </w:r>
+            <w:proofErr w:type="spellEnd"/>
+          </w:p>
+          <w:p>
+            <w:pPr>
+              <w:ind w:firstLine="0"/>
+              <w:jc w:val="left"/>
+            </w:pPr>
+            <w:r>
+              <w:t>sub</w:t>
+            </w:r>
+            <w:r>
+              <w:tab/>
+            </w:r>
+            <w:proofErr w:type="spellStart"/>
+            <w:r>
+              <w:t>rsp</w:t>
+            </w:r>
+            <w:proofErr w:type="spellEnd"/>
+            <w:r>
+              <w:t>, 32</w:t>
+            </w:r>
+          </w:p>
+          <w:p>
+            <w:pPr>
+              <w:ind w:firstLine="0"/>
+              <w:jc w:val="left"/>
+            </w:pPr>
+            <w:r>
+              <w:t>.</w:t>
+            </w:r>
+            <w:proofErr w:type="spellStart"/>
+            <w:r>
+              <w:t>seh_stackalloc</w:t>
+            </w:r>
+            <w:proofErr w:type="spellEnd"/>
+            <w:r>
+              <w:tab/>
+              <w:t>32</w:t>
+            </w:r>
+          </w:p>
+          <w:p>
+            <w:pPr>
+              <w:ind w:firstLine="0"/>
+              <w:jc w:val="left"/>
+            </w:pPr>
+            <w:r>
+              <w:t>.</w:t>
+            </w:r>
+            <w:proofErr w:type="spellStart"/>
+            <w:r>
               <w:t>seh_endprologue</w:t>
             </w:r>
             <w:proofErr w:type="spellEnd"/>
@@ -19077,16 +19243,113 @@
             </w:r>
             <w:r>
               <w:tab/>
-              <w:t>r8d, 100</w:t>
-            </w:r>
-          </w:p>
-          <w:p>
-            <w:pPr>
-              <w:ind w:firstLine="0"/>
-              <w:jc w:val="left"/>
-            </w:pPr>
-            <w:r>
-              <w:t>.p2align 5</w:t>
+            </w:r>
+            <w:proofErr w:type="spellStart"/>
+            <w:r>
+              <w:t>eax</w:t>
+            </w:r>
+            <w:proofErr w:type="spellEnd"/>
+            <w:r>
+              <w:t>, DWORD PTR "x"[rip]</w:t>
+            </w:r>
+          </w:p>
+          <w:p>
+            <w:pPr>
+              <w:ind w:firstLine="0"/>
+              <w:jc w:val="left"/>
+            </w:pPr>
+            <w:r>
+              <w:t>mov</w:t>
+            </w:r>
+            <w:r>
+              <w:tab/>
+            </w:r>
+            <w:proofErr w:type="spellStart"/>
+            <w:r>
+              <w:t>edx</w:t>
+            </w:r>
+            <w:proofErr w:type="spellEnd"/>
+            <w:r>
+              <w:t>, DWORD PTR "y"[rip]</w:t>
+            </w:r>
+          </w:p>
+          <w:p>
+            <w:pPr>
+              <w:ind w:firstLine="0"/>
+              <w:jc w:val="left"/>
+            </w:pPr>
+            <w:r>
+              <w:t>mov</w:t>
+            </w:r>
+            <w:r>
+              <w:tab/>
+            </w:r>
+            <w:proofErr w:type="spellStart"/>
+            <w:r>
+              <w:t>ebx</w:t>
+            </w:r>
+            <w:proofErr w:type="spellEnd"/>
+            <w:r>
+              <w:t>, 100</w:t>
+            </w:r>
+          </w:p>
+          <w:p>
+            <w:pPr>
+              <w:ind w:firstLine="0"/>
+              <w:jc w:val="left"/>
+            </w:pPr>
+            <w:r>
+              <w:t>.L3:</w:t>
+            </w:r>
+          </w:p>
+          <w:p>
+            <w:pPr>
+              <w:ind w:firstLine="0"/>
+              <w:jc w:val="left"/>
+            </w:pPr>
+            <w:proofErr w:type="spellStart"/>
+            <w:r>
+              <w:t>cmp</w:t>
+            </w:r>
+            <w:proofErr w:type="spellEnd"/>
+            <w:r>
+              <w:tab/>
+            </w:r>
+            <w:proofErr w:type="spellStart"/>
+            <w:r>
+              <w:t>eax</w:t>
+            </w:r>
+            <w:proofErr w:type="spellEnd"/>
+            <w:r>
+              <w:t xml:space="preserve">, </w:t>
+            </w:r>
+            <w:proofErr w:type="spellStart"/>
+            <w:r>
+              <w:t>edx</w:t>
+            </w:r>
+            <w:proofErr w:type="spellEnd"/>
+          </w:p>
+          <w:p>
+            <w:pPr>
+              <w:ind w:firstLine="0"/>
+              <w:jc w:val="left"/>
+            </w:pPr>
+            <w:r>
+              <w:lastRenderedPageBreak/>
+              <w:t>je</w:t>
+            </w:r>
+            <w:r>
+              <w:tab/>
+              <w:t>.L10</w:t>
+            </w:r>
+          </w:p>
+          <w:p>
+            <w:pPr>
+              <w:ind w:firstLine="0"/>
+              <w:jc w:val="left"/>
+            </w:pPr>
+            <w:r>
+              <w:t>.p2align 3</w:t>
             </w:r>
           </w:p>
           <w:p>
@@ -19113,7 +19376,195 @@
               <w:jc w:val="left"/>
             </w:pPr>
             <w:r>
-              <w:t>.L4:</w:t>
+              <w:t>.L2:</w:t>
+            </w:r>
+          </w:p>
+          <w:p>
+            <w:pPr>
+              <w:ind w:firstLine="0"/>
+              <w:jc w:val="left"/>
+            </w:pPr>
+            <w:r>
+              <w:t>sub</w:t>
+            </w:r>
+            <w:r>
+              <w:tab/>
+            </w:r>
+            <w:proofErr w:type="spellStart"/>
+            <w:r>
+              <w:t>ebx</w:t>
+            </w:r>
+            <w:proofErr w:type="spellEnd"/>
+            <w:r>
+              <w:t xml:space="preserve">, </w:t>
+            </w:r>
+            <w:proofErr w:type="spellStart"/>
+            <w:r>
+              <w:t>eax</w:t>
+            </w:r>
+            <w:proofErr w:type="spellEnd"/>
+          </w:p>
+          <w:p>
+            <w:pPr>
+              <w:ind w:firstLine="0"/>
+              <w:jc w:val="left"/>
+            </w:pPr>
+            <w:r>
+              <w:t>test</w:t>
+            </w:r>
+            <w:r>
+              <w:tab/>
+            </w:r>
+            <w:proofErr w:type="spellStart"/>
+            <w:r>
+              <w:t>ebx</w:t>
+            </w:r>
+            <w:proofErr w:type="spellEnd"/>
+            <w:r>
+              <w:t xml:space="preserve">, </w:t>
+            </w:r>
+            <w:proofErr w:type="spellStart"/>
+            <w:r>
+              <w:t>ebx</w:t>
+            </w:r>
+            <w:proofErr w:type="spellEnd"/>
+          </w:p>
+          <w:p>
+            <w:pPr>
+              <w:ind w:firstLine="0"/>
+              <w:jc w:val="left"/>
+            </w:pPr>
+            <w:proofErr w:type="spellStart"/>
+            <w:r>
+              <w:t>jg</w:t>
+            </w:r>
+            <w:proofErr w:type="spellEnd"/>
+            <w:r>
+              <w:tab/>
+              <w:t>.L2</w:t>
+            </w:r>
+          </w:p>
+          <w:p>
+            <w:pPr>
+              <w:ind w:firstLine="0"/>
+              <w:jc w:val="left"/>
+            </w:pPr>
+            <w:r>
+              <w:t>add</w:t>
+            </w:r>
+            <w:r>
+              <w:tab/>
+            </w:r>
+            <w:proofErr w:type="spellStart"/>
+            <w:r>
+              <w:t>eax</w:t>
+            </w:r>
+            <w:proofErr w:type="spellEnd"/>
+            <w:r>
+              <w:t xml:space="preserve">, </w:t>
+            </w:r>
+            <w:proofErr w:type="spellStart"/>
+            <w:r>
+              <w:t>edx</w:t>
+            </w:r>
+            <w:proofErr w:type="spellEnd"/>
+          </w:p>
+          <w:p>
+            <w:pPr>
+              <w:ind w:firstLine="0"/>
+              <w:jc w:val="left"/>
+            </w:pPr>
+            <w:r>
+              <w:t>add</w:t>
+            </w:r>
+            <w:r>
+              <w:tab/>
+            </w:r>
+            <w:proofErr w:type="spellStart"/>
+            <w:r>
+              <w:t>eax</w:t>
+            </w:r>
+            <w:proofErr w:type="spellEnd"/>
+            <w:r>
+              <w:t xml:space="preserve">, </w:t>
+            </w:r>
+            <w:proofErr w:type="spellStart"/>
+            <w:r>
+              <w:t>ebx</w:t>
+            </w:r>
+            <w:proofErr w:type="spellEnd"/>
+          </w:p>
+          <w:p>
+            <w:pPr>
+              <w:ind w:firstLine="0"/>
+              <w:jc w:val="left"/>
+            </w:pPr>
+            <w:r>
+              <w:t>add</w:t>
+            </w:r>
+            <w:r>
+              <w:tab/>
+            </w:r>
+            <w:proofErr w:type="spellStart"/>
+            <w:r>
+              <w:t>rsp</w:t>
+            </w:r>
+            <w:proofErr w:type="spellEnd"/>
+            <w:r>
+              <w:t>, 32</w:t>
+            </w:r>
+          </w:p>
+          <w:p>
+            <w:pPr>
+              <w:ind w:firstLine="0"/>
+              <w:jc w:val="left"/>
+            </w:pPr>
+            <w:r>
+              <w:t>pop</w:t>
+            </w:r>
+            <w:r>
+              <w:tab/>
+            </w:r>
+            <w:proofErr w:type="spellStart"/>
+            <w:r>
+              <w:t>rbx</w:t>
+            </w:r>
+            <w:proofErr w:type="spellEnd"/>
+          </w:p>
+          <w:p>
+            <w:pPr>
+              <w:ind w:firstLine="0"/>
+              <w:jc w:val="left"/>
+            </w:pPr>
+            <w:r>
+              <w:t>ret</w:t>
+            </w:r>
+          </w:p>
+          <w:p>
+            <w:pPr>
+              <w:ind w:firstLine="0"/>
+              <w:jc w:val="left"/>
+            </w:pPr>
+            <w:r>
+              <w:t>.p2align 4,,10</w:t>
+            </w:r>
+          </w:p>
+          <w:p>
+            <w:pPr>
+              <w:ind w:firstLine="0"/>
+              <w:jc w:val="left"/>
+            </w:pPr>
+            <w:r>
+              <w:t>.p2align 3</w:t>
+            </w:r>
+          </w:p>
+          <w:p>
+            <w:pPr>
+              <w:ind w:firstLine="0"/>
+              <w:jc w:val="left"/>
+            </w:pPr>
+            <w:r>
+              <w:t>.L10:</w:t>
             </w:r>
           </w:p>
           <w:p>
@@ -19129,11 +19580,65 @@
             </w:r>
             <w:proofErr w:type="spellStart"/>
             <w:r>
-              <w:t>eax</w:t>
-            </w:r>
-            <w:proofErr w:type="spellEnd"/>
-            <w:r>
-              <w:t>, -1[r8]</w:t>
+              <w:t>rcx</w:t>
+            </w:r>
+            <w:proofErr w:type="spellEnd"/>
+            <w:r>
+              <w:t>, .LC0[rip]</w:t>
+            </w:r>
+          </w:p>
+          <w:p>
+            <w:pPr>
+              <w:ind w:firstLine="0"/>
+              <w:jc w:val="left"/>
+            </w:pPr>
+            <w:r>
+              <w:t>call</w:t>
+            </w:r>
+            <w:r>
+              <w:tab/>
+              <w:t>"puts"</w:t>
+            </w:r>
+          </w:p>
+          <w:p>
+            <w:pPr>
+              <w:ind w:firstLine="0"/>
+              <w:jc w:val="left"/>
+            </w:pPr>
+            <w:r>
+              <w:lastRenderedPageBreak/>
+              <w:t>mov</w:t>
+            </w:r>
+            <w:r>
+              <w:tab/>
+            </w:r>
+            <w:proofErr w:type="spellStart"/>
+            <w:r>
+              <w:t>eax</w:t>
+            </w:r>
+            <w:proofErr w:type="spellEnd"/>
+            <w:r>
+              <w:t>, DWORD PTR "x"[rip]</w:t>
+            </w:r>
+          </w:p>
+          <w:p>
+            <w:pPr>
+              <w:ind w:firstLine="0"/>
+              <w:jc w:val="left"/>
+            </w:pPr>
+            <w:r>
+              <w:t>mov</w:t>
+            </w:r>
+            <w:r>
+              <w:tab/>
+            </w:r>
+            <w:proofErr w:type="spellStart"/>
+            <w:r>
+              <w:t>edx</w:t>
+            </w:r>
+            <w:proofErr w:type="spellEnd"/>
+            <w:r>
+              <w:t>, DWORD PTR "y"[rip]</w:t>
             </w:r>
           </w:p>
           <w:p>
@@ -19146,30 +19651,45 @@
             </w:r>
             <w:r>
               <w:tab/>
-              <w:t xml:space="preserve">r8d, </w:t>
-            </w:r>
-            <w:proofErr w:type="spellStart"/>
-            <w:r>
-              <w:t>ecx</w:t>
-            </w:r>
-            <w:proofErr w:type="spellEnd"/>
-          </w:p>
-          <w:p>
-            <w:pPr>
-              <w:ind w:firstLine="0"/>
-              <w:jc w:val="left"/>
-            </w:pPr>
-            <w:proofErr w:type="spellStart"/>
-            <w:r>
-              <w:t>cmp</w:t>
-            </w:r>
-            <w:proofErr w:type="spellEnd"/>
-            <w:r>
-              <w:tab/>
-            </w:r>
-            <w:proofErr w:type="spellStart"/>
-            <w:r>
-              <w:t>ecx</w:t>
+            </w:r>
+            <w:proofErr w:type="spellStart"/>
+            <w:r>
+              <w:t>ebx</w:t>
+            </w:r>
+            <w:proofErr w:type="spellEnd"/>
+            <w:r>
+              <w:t>, 1</w:t>
+            </w:r>
+          </w:p>
+          <w:p>
+            <w:pPr>
+              <w:ind w:firstLine="0"/>
+              <w:jc w:val="left"/>
+            </w:pPr>
+            <w:proofErr w:type="spellStart"/>
+            <w:r>
+              <w:t>jne</w:t>
+            </w:r>
+            <w:proofErr w:type="spellEnd"/>
+            <w:r>
+              <w:tab/>
+              <w:t>.L3</w:t>
+            </w:r>
+          </w:p>
+          <w:p>
+            <w:pPr>
+              <w:ind w:firstLine="0"/>
+              <w:jc w:val="left"/>
+            </w:pPr>
+            <w:r>
+              <w:t>add</w:t>
+            </w:r>
+            <w:r>
+              <w:tab/>
+            </w:r>
+            <w:proofErr w:type="spellStart"/>
+            <w:r>
+              <w:t>eax</w:t>
             </w:r>
             <w:proofErr w:type="spellEnd"/>
             <w:r>
@@ -19186,55 +19706,6 @@
               <w:ind w:firstLine="0"/>
               <w:jc w:val="left"/>
             </w:pPr>
-            <w:proofErr w:type="spellStart"/>
-            <w:r>
-              <w:t>cmove</w:t>
-            </w:r>
-            <w:proofErr w:type="spellEnd"/>
-            <w:r>
-              <w:tab/>
-              <w:t xml:space="preserve">r8d, </w:t>
-            </w:r>
-            <w:proofErr w:type="spellStart"/>
-            <w:r>
-              <w:t>eax</w:t>
-            </w:r>
-            <w:proofErr w:type="spellEnd"/>
-          </w:p>
-          <w:p>
-            <w:pPr>
-              <w:ind w:firstLine="0"/>
-              <w:jc w:val="left"/>
-            </w:pPr>
-            <w:r>
-              <w:lastRenderedPageBreak/>
-              <w:t>test</w:t>
-            </w:r>
-            <w:r>
-              <w:tab/>
-              <w:t>r8d, r8d</w:t>
-            </w:r>
-          </w:p>
-          <w:p>
-            <w:pPr>
-              <w:ind w:firstLine="0"/>
-              <w:jc w:val="left"/>
-            </w:pPr>
-            <w:proofErr w:type="spellStart"/>
-            <w:r>
-              <w:t>jg</w:t>
-            </w:r>
-            <w:proofErr w:type="spellEnd"/>
-            <w:r>
-              <w:tab/>
-              <w:t>.L4</w:t>
-            </w:r>
-          </w:p>
-          <w:p>
-            <w:pPr>
-              <w:ind w:firstLine="0"/>
-              <w:jc w:val="left"/>
-            </w:pPr>
             <w:r>
               <w:t>add</w:t>
             </w:r>
@@ -19243,7 +19714,7 @@
             </w:r>
             <w:proofErr w:type="spellStart"/>
             <w:r>
-              <w:t>ecx</w:t>
+              <w:t>eax</w:t>
             </w:r>
             <w:proofErr w:type="spellEnd"/>
             <w:r>
@@ -19251,42 +19722,46 @@
             </w:r>
             <w:proofErr w:type="spellStart"/>
             <w:r>
-              <w:t>edx</w:t>
-            </w:r>
-            <w:proofErr w:type="spellEnd"/>
-          </w:p>
-          <w:p>
-            <w:pPr>
-              <w:ind w:firstLine="0"/>
-              <w:jc w:val="left"/>
-            </w:pPr>
-            <w:r>
-              <w:t>mov</w:t>
-            </w:r>
-            <w:r>
-              <w:tab/>
-              <w:t>DWORD PTR "k"[rip], r8d</w:t>
-            </w:r>
-          </w:p>
-          <w:p>
-            <w:pPr>
-              <w:ind w:firstLine="0"/>
-              <w:jc w:val="left"/>
-            </w:pPr>
-            <w:r>
-              <w:t>lea</w:t>
-            </w:r>
-            <w:r>
-              <w:tab/>
-            </w:r>
-            <w:proofErr w:type="spellStart"/>
-            <w:r>
-              <w:t>eax</w:t>
-            </w:r>
-            <w:proofErr w:type="spellEnd"/>
-            <w:r>
-              <w:t>, [rcx+r8]</w:t>
-            </w:r>
+              <w:t>ebx</w:t>
+            </w:r>
+            <w:proofErr w:type="spellEnd"/>
+          </w:p>
+          <w:p>
+            <w:pPr>
+              <w:ind w:firstLine="0"/>
+              <w:jc w:val="left"/>
+            </w:pPr>
+            <w:r>
+              <w:t>add</w:t>
+            </w:r>
+            <w:r>
+              <w:tab/>
+            </w:r>
+            <w:proofErr w:type="spellStart"/>
+            <w:r>
+              <w:t>rsp</w:t>
+            </w:r>
+            <w:proofErr w:type="spellEnd"/>
+            <w:r>
+              <w:t>, 32</w:t>
+            </w:r>
+          </w:p>
+          <w:p>
+            <w:pPr>
+              <w:ind w:firstLine="0"/>
+              <w:jc w:val="left"/>
+            </w:pPr>
+            <w:r>
+              <w:t>pop</w:t>
+            </w:r>
+            <w:r>
+              <w:tab/>
+            </w:r>
+            <w:proofErr w:type="spellStart"/>
+            <w:r>
+              <w:t>rbx</w:t>
+            </w:r>
+            <w:proofErr w:type="spellEnd"/>
           </w:p>
           <w:p>
             <w:pPr>
@@ -19306,7 +19781,122 @@
             <w:pPr>
               <w:ind w:firstLine="0"/>
               <w:jc w:val="left"/>
-            </w:pPr>
+              <w:rPr>
+                <w:lang w:val="ru-RU"/>
+              </w:rPr>
+            </w:pPr>
+            <w:r>
+              <w:rPr>
+                <w:lang w:val="ru-RU"/>
+              </w:rPr>
+              <w:lastRenderedPageBreak/>
+              <w:t xml:space="preserve">Компилятор не применяет разъединение циклов при </w:t>
+            </w:r>
+            <w:r>
+              <w:rPr>
+                <w:lang w:val="ru-RU"/>
+              </w:rPr>
+              <w:t>-</w:t>
+            </w:r>
+            <w:r>
+              <w:t>O</w:t>
+            </w:r>
+            <w:r>
+              <w:rPr>
+                <w:lang w:val="ru-RU"/>
+              </w:rPr>
+              <w:t xml:space="preserve">2, </w:t>
+            </w:r>
+            <w:r>
+              <w:rPr>
+                <w:lang w:val="ru-RU"/>
+              </w:rPr>
+              <w:t xml:space="preserve">но применяет при </w:t>
+            </w:r>
+            <w:r>
+              <w:rPr>
+                <w:lang w:val="ru-RU"/>
+              </w:rPr>
+              <w:t>-</w:t>
+            </w:r>
+            <w:r>
+              <w:t>O</w:t>
+            </w:r>
+            <w:r>
+              <w:rPr>
+                <w:lang w:val="ru-RU"/>
+              </w:rPr>
+              <w:t xml:space="preserve">3, </w:t>
+            </w:r>
+            <w:r>
+              <w:rPr>
+                <w:lang w:val="ru-RU"/>
+              </w:rPr>
+              <w:t xml:space="preserve">разделяя условный оператор внутри цикла на два отдельных внутренних цикла, в одном из которых происходит сравнение </w:t>
+            </w:r>
+            <w:r>
+              <w:t>x</w:t>
+            </w:r>
+            <w:r>
+              <w:rPr>
+                <w:lang w:val="ru-RU"/>
+              </w:rPr>
+              <w:t xml:space="preserve"> </w:t>
+            </w:r>
+            <w:r>
+              <w:rPr>
+                <w:lang w:val="ru-RU"/>
+              </w:rPr>
+              <w:t xml:space="preserve">и </w:t>
+            </w:r>
+            <w:r>
+              <w:t>y</w:t>
+            </w:r>
+            <w:r>
+              <w:rPr>
+                <w:lang w:val="ru-RU"/>
+              </w:rPr>
+              <w:t xml:space="preserve"> </w:t>
+            </w:r>
+            <w:r>
+              <w:rPr>
+                <w:lang w:val="ru-RU"/>
+              </w:rPr>
+              <w:t xml:space="preserve">и декремент </w:t>
+            </w:r>
+            <w:r>
+              <w:t>k</w:t>
+            </w:r>
+            <w:r>
+              <w:rPr>
+                <w:lang w:val="ru-RU"/>
+              </w:rPr>
+              <w:t xml:space="preserve">, </w:t>
+            </w:r>
+            <w:r>
+              <w:rPr>
+                <w:lang w:val="ru-RU"/>
+              </w:rPr>
+              <w:t xml:space="preserve">в другом – более сложная операция </w:t>
+            </w:r>
+            <w:r>
+              <w:t>k</w:t>
+            </w:r>
+            <w:r>
+              <w:rPr>
+                <w:lang w:val="ru-RU"/>
+              </w:rPr>
+              <w:t xml:space="preserve"> -= </w:t>
+            </w:r>
+            <w:r>
+              <w:t>x</w:t>
+            </w:r>
+            <w:r>
+              <w:rPr>
+                <w:lang w:val="ru-RU"/>
+              </w:rPr>
+              <w:t>.</w:t>
+            </w:r>
           </w:p>
         </w:tc>
       </w:tr>
@@ -19316,7 +19906,7 @@
         <w:ind w:firstLine="0"/>
         <w:jc w:val="center"/>
         <w:rPr>
-          <w:lang w:eastAsia="ru-RU"/>
+          <w:lang w:val="ru-RU" w:eastAsia="ru-RU"/>
         </w:rPr>
         <w:sectPr>
           <w:pgSz w:w="16838" w:h="11906" w:orient="landscape"/>
@@ -19584,6 +20174,12 @@
               </w:rPr>
               <w:t>Размер исполняемого файла</w:t>
             </w:r>
+            <w:r>
+              <w:rPr>
+                <w:lang w:val="ru-RU"/>
+              </w:rPr>
+              <w:t>, байт</w:t>
+            </w:r>
           </w:p>
         </w:tc>
       </w:tr>
@@ -19658,7 +20254,19 @@
               <w:rPr>
                 <w:lang w:val="ru-RU"/>
               </w:rPr>
-              <w:t>-</w:t>
+              <w:t>135</w:t>
+            </w:r>
+            <w:r>
+              <w:rPr>
+                <w:lang w:val="ru-RU"/>
+              </w:rPr>
+              <w:t> </w:t>
+            </w:r>
+            <w:r>
+              <w:rPr>
+                <w:lang w:val="ru-RU"/>
+              </w:rPr>
+              <w:t>683</w:t>
             </w:r>
           </w:p>
         </w:tc>
@@ -19714,15 +20322,9 @@
             <w:pPr>
               <w:ind w:firstLine="0"/>
               <w:jc w:val="center"/>
-              <w:rPr>
-                <w:lang w:val="ru-RU"/>
-              </w:rPr>
-            </w:pPr>
-            <w:r>
-              <w:rPr>
-                <w:lang w:val="ru-RU"/>
-              </w:rPr>
-              <w:t>-</w:t>
+            </w:pPr>
+            <w:r>
+              <w:t>138 053</w:t>
             </w:r>
           </w:p>
         </w:tc>
@@ -19797,7 +20399,7 @@
               <w:rPr>
                 <w:lang w:val="ru-RU"/>
               </w:rPr>
-              <w:t>-</w:t>
+              <w:t>138 053</w:t>
             </w:r>
           </w:p>
         </w:tc>
@@ -19872,7 +20474,7 @@
               <w:rPr>
                 <w:lang w:val="ru-RU"/>
               </w:rPr>
-              <w:t>-</w:t>
+              <w:t>135 647</w:t>
             </w:r>
           </w:p>
         </w:tc>
@@ -19944,13 +20546,16 @@
               </w:rPr>
             </w:pPr>
             <w:r>
-              <w:t>135299</w:t>
-            </w:r>
-            <w:r>
-              <w:rPr>
-                <w:lang w:val="ru-RU"/>
-              </w:rPr>
-              <w:t xml:space="preserve"> байт</w:t>
+              <w:t>135</w:t>
+            </w:r>
+            <w:r>
+              <w:rPr>
+                <w:lang w:val="ru-RU"/>
+              </w:rPr>
+              <w:t xml:space="preserve"> </w:t>
+            </w:r>
+            <w:r>
+              <w:t>299</w:t>
             </w:r>
           </w:p>
         </w:tc>
@@ -19968,6 +20573,9 @@
             <w:r>
               <w:t>-Oz</w:t>
             </w:r>
+            <w:r>
+              <w:t xml:space="preserve"> + inline</w:t>
+            </w:r>
           </w:p>
         </w:tc>
         <w:tc>
@@ -20020,7 +20628,7 @@
               <w:rPr>
                 <w:lang w:val="ru-RU"/>
               </w:rPr>
-              <w:t>-</w:t>
+              <w:t>135 171</w:t>
             </w:r>
           </w:p>
         </w:tc>
@@ -20106,7 +20714,7 @@
               <w:rPr>
                 <w:lang w:val="ru-RU"/>
               </w:rPr>
-              <w:t>-</w:t>
+              <w:t>138 053</w:t>
             </w:r>
           </w:p>
         </w:tc>
@@ -20192,7 +20800,7 @@
               <w:rPr>
                 <w:lang w:val="ru-RU"/>
               </w:rPr>
-              <w:t>-</w:t>
+              <w:t>138 565</w:t>
             </w:r>
           </w:p>
         </w:tc>
@@ -20219,13 +20827,7 @@
             </w:r>
             <w:proofErr w:type="spellEnd"/>
             <w:r>
-              <w:t xml:space="preserve"> + inline-</w:t>
-            </w:r>
-            <w:r>
-              <w:rPr>
-                <w:lang w:val="ru-RU"/>
-              </w:rPr>
-              <w:t>оптимизация</w:t>
+              <w:t xml:space="preserve"> + inline</w:t>
             </w:r>
           </w:p>
         </w:tc>
@@ -20267,13 +20869,91 @@
               <w:jc w:val="center"/>
             </w:pPr>
             <w:r>
-              <w:t>135171</w:t>
-            </w:r>
-            <w:r>
-              <w:rPr>
-                <w:lang w:val="ru-RU"/>
-              </w:rPr>
-              <w:t xml:space="preserve"> байт</w:t>
+              <w:t>135</w:t>
+            </w:r>
+            <w:r>
+              <w:rPr>
+                <w:lang w:val="ru-RU"/>
+              </w:rPr>
+              <w:t xml:space="preserve"> </w:t>
+            </w:r>
+            <w:r>
+              <w:t>171</w:t>
+            </w:r>
+          </w:p>
+        </w:tc>
+      </w:tr>
+      <w:tr>
+        <w:tc>
+          <w:tcPr>
+            <w:tcW w:w="2483" w:type="dxa"/>
+          </w:tcPr>
+          <w:p>
+            <w:pPr>
+              <w:ind w:firstLine="0"/>
+              <w:jc w:val="left"/>
+            </w:pPr>
+            <w:r>
+              <w:t>-</w:t>
+            </w:r>
+            <w:proofErr w:type="spellStart"/>
+            <w:r>
+              <w:t>Os</w:t>
+            </w:r>
+            <w:proofErr w:type="spellEnd"/>
+            <w:r>
+              <w:t xml:space="preserve"> -s +</w:t>
+            </w:r>
+            <w:r>
+              <w:rPr>
+                <w:lang w:val="ru-RU"/>
+              </w:rPr>
+              <w:t xml:space="preserve"> </w:t>
+            </w:r>
+            <w:r>
+              <w:t>inline</w:t>
+            </w:r>
+          </w:p>
+        </w:tc>
+        <w:tc>
+          <w:tcPr>
+            <w:tcW w:w="2440" w:type="dxa"/>
+          </w:tcPr>
+          <w:p>
+            <w:pPr>
+              <w:ind w:firstLine="0"/>
+              <w:jc w:val="center"/>
+            </w:pPr>
+            <w:r>
+              <w:t>693.845</w:t>
+            </w:r>
+          </w:p>
+        </w:tc>
+        <w:tc>
+          <w:tcPr>
+            <w:tcW w:w="2527" w:type="dxa"/>
+          </w:tcPr>
+          <w:p>
+            <w:pPr>
+              <w:ind w:firstLine="0"/>
+              <w:jc w:val="center"/>
+            </w:pPr>
+            <w:r>
+              <w:t>211</w:t>
+            </w:r>
+          </w:p>
+        </w:tc>
+        <w:tc>
+          <w:tcPr>
+            <w:tcW w:w="1895" w:type="dxa"/>
+          </w:tcPr>
+          <w:p>
+            <w:pPr>
+              <w:ind w:firstLine="0"/>
+              <w:jc w:val="center"/>
+            </w:pPr>
+            <w:r>
+              <w:t>17 920</w:t>
             </w:r>
           </w:p>
         </w:tc>
@@ -20372,14 +21052,21 @@
         <w:rPr>
           <w:lang w:val="ru-RU" w:eastAsia="ru-RU"/>
         </w:rPr>
+        <w:lastRenderedPageBreak/>
         <w:tab/>
-        <w:t xml:space="preserve">Наименьшее кол-во строк ассемблера даёт оптимизация </w:t>
+        <w:t>Наименьш</w:t>
       </w:r>
       <w:r>
         <w:rPr>
           <w:lang w:val="ru-RU" w:eastAsia="ru-RU"/>
         </w:rPr>
-        <w:t>–</w:t>
+        <w:t xml:space="preserve">ий размер исполняемого файла даёт режим оптимизации </w:t>
+      </w:r>
+      <w:r>
+        <w:rPr>
+          <w:lang w:val="ru-RU" w:eastAsia="ru-RU"/>
+        </w:rPr>
+        <w:t>-</w:t>
       </w:r>
       <w:proofErr w:type="spellStart"/>
       <w:r>
@@ -20393,7 +21080,7 @@
         <w:rPr>
           <w:lang w:val="ru-RU" w:eastAsia="ru-RU"/>
         </w:rPr>
-        <w:t xml:space="preserve"> + </w:t>
+        <w:t xml:space="preserve"> с </w:t>
       </w:r>
       <w:r>
         <w:rPr>
@@ -20411,22 +21098,8 @@
         <w:rPr>
           <w:lang w:val="ru-RU" w:eastAsia="ru-RU"/>
         </w:rPr>
-        <w:t xml:space="preserve">оптимизация, что не удивительно, т.к. режим </w:t>
+        <w:t>оптимизацией</w:t>
       </w:r>
-      <w:r>
-        <w:rPr>
-          <w:lang w:val="ru-RU" w:eastAsia="ru-RU"/>
-        </w:rPr>
-        <w:t>–</w:t>
-      </w:r>
-      <w:proofErr w:type="spellStart"/>
-      <w:r>
-        <w:rPr>
-          <w:lang w:eastAsia="ru-RU"/>
-        </w:rPr>
-        <w:t>Os</w:t>
-      </w:r>
-      <w:proofErr w:type="spellEnd"/>
       <w:r>
         <w:rPr>
           <w:lang w:val="ru-RU" w:eastAsia="ru-RU"/>
@@ -20437,20 +21110,7 @@
         <w:rPr>
           <w:lang w:val="ru-RU" w:eastAsia="ru-RU"/>
         </w:rPr>
-        <w:t xml:space="preserve">содержит лишь те флаги </w:t>
-      </w:r>
-      <w:r>
-        <w:rPr>
-          <w:lang w:val="ru-RU" w:eastAsia="ru-RU"/>
-        </w:rPr>
-        <w:lastRenderedPageBreak/>
-        <w:t xml:space="preserve">оптимизации, которые либо не меняют, либо уменьшают размер ассемблерного файла. </w:t>
-      </w:r>
-      <w:r>
-        <w:rPr>
-          <w:lang w:eastAsia="ru-RU"/>
-        </w:rPr>
-        <w:t>Inline</w:t>
+        <w:t xml:space="preserve">вместе с опцией </w:t>
       </w:r>
       <w:r>
         <w:rPr>
@@ -20460,32 +21120,26 @@
       </w:r>
       <w:r>
         <w:rPr>
-          <w:lang w:val="ru-RU" w:eastAsia="ru-RU"/>
+          <w:lang w:eastAsia="ru-RU"/>
         </w:rPr>
-        <w:t>оптимизация выигрывает ещё 9 строчек, заменяя вызов функции на код самой функции</w:t>
+        <w:t>s</w:t>
       </w:r>
       <w:r>
         <w:rPr>
           <w:lang w:val="ru-RU" w:eastAsia="ru-RU"/>
         </w:rPr>
-        <w:t>, экономя 128 байт исполняемого файла.</w:t>
+        <w:t xml:space="preserve">, </w:t>
+      </w:r>
+      <w:r>
+        <w:rPr>
+          <w:lang w:val="ru-RU" w:eastAsia="ru-RU"/>
+        </w:rPr>
+        <w:t>заставляющую компилятор удалить все данные, необходимые для отладки программы.</w:t>
       </w:r>
     </w:p>
     <w:p>
       <w:pPr>
-        <w:pStyle w:val="1"/>
-        <w:numPr>
-          <w:ilvl w:val="0"/>
-          <w:numId w:val="0"/>
-        </w:numPr>
-      </w:pPr>
-      <w:r>
-        <w:lastRenderedPageBreak/>
-        <w:t>Выводы</w:t>
-      </w:r>
-    </w:p>
-    <w:p>
-      <w:pPr>
+        <w:ind w:firstLine="0"/>
         <w:rPr>
           <w:lang w:val="ru-RU" w:eastAsia="ru-RU"/>
         </w:rPr>
@@ -20538,13 +21192,7 @@
         <w:rPr>
           <w:lang w:val="ru-RU" w:eastAsia="ru-RU"/>
         </w:rPr>
-        <w:t>весьма продвинуты</w:t>
-      </w:r>
-      <w:r>
-        <w:rPr>
-          <w:lang w:val="ru-RU" w:eastAsia="ru-RU"/>
-        </w:rPr>
-        <w:t>, так как все те оптимизации, которые подразумевались при проверке, были им исполнены, а в большинстве случаев компилятор делал гораздо больше. Даже в режиме –</w:t>
+        <w:t>весьма продвинуты, так как все те оптимизации, которые подразумевались при проверке, были им исполнены, а в большинстве случаев компилятор делал гораздо больше. Даже в режиме –</w:t>
       </w:r>
       <w:r>
         <w:rPr>
@@ -20614,13 +21262,7 @@
         <w:rPr>
           <w:lang w:val="ru-RU" w:eastAsia="ru-RU"/>
         </w:rPr>
-        <w:t>самой эффективной по размеру ассемблерного файла</w:t>
-      </w:r>
-      <w:r>
-        <w:rPr>
-          <w:lang w:val="ru-RU" w:eastAsia="ru-RU"/>
-        </w:rPr>
-        <w:t xml:space="preserve"> и исполняемого файла</w:t>
+        <w:t>самой эффективной по размеру ассемблерного файла и исполняемого файла</w:t>
       </w:r>
       <w:r>
         <w:rPr>
@@ -20658,22 +21300,126 @@
         <w:rPr>
           <w:lang w:val="ru-RU" w:eastAsia="ru-RU"/>
         </w:rPr>
-        <w:t>оптимизация.</w:t>
+        <w:t>оптимизация</w:t>
+      </w:r>
+      <w:r>
+        <w:rPr>
+          <w:lang w:val="ru-RU" w:eastAsia="ru-RU"/>
+        </w:rPr>
+        <w:t xml:space="preserve"> + </w:t>
+      </w:r>
+      <w:r>
+        <w:rPr>
+          <w:lang w:val="ru-RU" w:eastAsia="ru-RU"/>
+        </w:rPr>
+        <w:t>-</w:t>
+      </w:r>
+      <w:r>
+        <w:rPr>
+          <w:lang w:eastAsia="ru-RU"/>
+        </w:rPr>
+        <w:t>s</w:t>
+      </w:r>
+      <w:r>
+        <w:rPr>
+          <w:lang w:val="ru-RU" w:eastAsia="ru-RU"/>
+        </w:rPr>
+        <w:t>.</w:t>
       </w:r>
     </w:p>
     <w:p>
       <w:pPr>
+        <w:pStyle w:val="1"/>
+        <w:numPr>
+          <w:ilvl w:val="0"/>
+          <w:numId w:val="0"/>
+        </w:numPr>
+      </w:pPr>
+      <w:r>
+        <w:lastRenderedPageBreak/>
+        <w:t>Выводы</w:t>
+      </w:r>
+    </w:p>
+    <w:p>
+      <w:pPr>
+        <w:ind w:firstLine="0"/>
+        <w:rPr>
+          <w:lang w:eastAsia="ru-RU"/>
+        </w:rPr>
+      </w:pPr>
+      <w:r>
         <w:rPr>
           <w:lang w:val="ru-RU" w:eastAsia="ru-RU"/>
         </w:rPr>
-      </w:pPr>
-    </w:p>
-    <w:p>
-      <w:pPr>
+        <w:tab/>
+        <w:t xml:space="preserve">В данной лабораторной работе был изучен компилятор </w:t>
+      </w:r>
+      <w:proofErr w:type="spellStart"/>
+      <w:r>
+        <w:rPr>
+          <w:lang w:eastAsia="ru-RU"/>
+        </w:rPr>
+        <w:t>gcc</w:t>
+      </w:r>
+      <w:proofErr w:type="spellEnd"/>
+      <w:r>
         <w:rPr>
           <w:lang w:val="ru-RU" w:eastAsia="ru-RU"/>
         </w:rPr>
-      </w:pPr>
+        <w:t xml:space="preserve">. </w:t>
+      </w:r>
+      <w:r>
+        <w:rPr>
+          <w:lang w:val="ru-RU" w:eastAsia="ru-RU"/>
+        </w:rPr>
+        <w:t>Мне понравилось, что данный компилятор очень хорошо анализирует циклы</w:t>
+      </w:r>
+      <w:r>
+        <w:rPr>
+          <w:lang w:val="ru-RU" w:eastAsia="ru-RU"/>
+        </w:rPr>
+        <w:t xml:space="preserve">, заменяя их на последовательность команд без переходов, и функции, вычисляя их результат заранее и заменяя результат их работы на константу. Мне не понравилось, что в </w:t>
+      </w:r>
+      <w:proofErr w:type="spellStart"/>
+      <w:r>
+        <w:rPr>
+          <w:lang w:eastAsia="ru-RU"/>
+        </w:rPr>
+        <w:t>gcc</w:t>
+      </w:r>
+      <w:proofErr w:type="spellEnd"/>
+      <w:r>
+        <w:rPr>
+          <w:lang w:val="ru-RU" w:eastAsia="ru-RU"/>
+        </w:rPr>
+        <w:t xml:space="preserve"> </w:t>
+      </w:r>
+      <w:r>
+        <w:rPr>
+          <w:lang w:val="ru-RU" w:eastAsia="ru-RU"/>
+        </w:rPr>
+        <w:t xml:space="preserve">отсутствует оптимизация использования предыдущих вычислений в цикле, а также что из-за сильного изменения порядка исполнения </w:t>
+      </w:r>
+      <w:r>
+        <w:rPr>
+          <w:lang w:val="ru-RU" w:eastAsia="ru-RU"/>
+        </w:rPr>
+        <w:t xml:space="preserve">блоков кода теоретически может возникнуть ошибка компиляции. В целом, я доволен результатом режимов оптимизации компилятора </w:t>
+      </w:r>
+      <w:proofErr w:type="spellStart"/>
+      <w:r>
+        <w:rPr>
+          <w:lang w:eastAsia="ru-RU"/>
+        </w:rPr>
+        <w:t>gcc</w:t>
+      </w:r>
+      <w:proofErr w:type="spellEnd"/>
+      <w:r>
+        <w:rPr>
+          <w:lang w:eastAsia="ru-RU"/>
+        </w:rPr>
+        <w:t>.</w:t>
+      </w:r>
     </w:p>
     <w:p>
       <w:pPr>

</xml_diff>